<commit_message>
Director style resume: Education page 1, Achievements page 2
Co-authored-by: Sonaal8 <Sonaal8@users.noreply.github.com>
</commit_message>
<xml_diff>
--- a/job-prep-docs/SONAAL_TOPNO_Resume_Director_Analytics_Style.docx
+++ b/job-prep-docs/SONAAL_TOPNO_Resume_Director_Analytics_Style.docx
@@ -312,6 +312,20 @@
           <w:b/>
           <w:sz w:val="22"/>
         </w:rPr>
+        <w:t>EDUCATION</w:t>
+      </w:r>
+    </w:p>
+    <w:p>
+      <w:r>
+        <w:t>Integrated B.Tech &amp; M.Tech, Geophysical Technology | Indian Institute of Technology (IIT) Roorkee | 2010 – 2015</w:t>
+      </w:r>
+    </w:p>
+    <w:p>
+      <w:r>
+        <w:rPr>
+          <w:b/>
+          <w:sz w:val="22"/>
+        </w:rPr>
         <w:t>KEY ACHIEVEMENTS &amp; RECOGNITION</w:t>
       </w:r>
     </w:p>
@@ -390,20 +404,6 @@
       </w:r>
       <w:r>
         <w:t>Uses Cursor and GitHub Copilot to accelerate SQL development, internal app builds, Power BI logic, and repeatable reporting for marketing and commercial teams.</w:t>
-      </w:r>
-    </w:p>
-    <w:p>
-      <w:r>
-        <w:rPr>
-          <w:b/>
-          <w:sz w:val="22"/>
-        </w:rPr>
-        <w:t>EDUCATION</w:t>
-      </w:r>
-    </w:p>
-    <w:p>
-      <w:r>
-        <w:t>Integrated B.Tech &amp; M.Tech, Geophysical Technology | Indian Institute of Technology (IIT) Roorkee | 2010 – 2015</w:t>
       </w:r>
     </w:p>
     <w:sectPr>

</xml_diff>